<commit_message>
Add Project Demonstration documents
</commit_message>
<xml_diff>
--- a/8. Project Demonstration/Communication.docx
+++ b/8. Project Demonstration/Communication.docx
@@ -25,7 +25,7 @@
     </w:p>
     <w:p>
       <w:pPr>
-        <w:spacing w:line="240" w:lineRule="auto"/>
+        <w:spacing w:after="0"/>
         <w:rPr>
           <w:rFonts w:cs="Times New Roman"/>
           <w:color w:val="000000" w:themeColor="text1"/>
@@ -49,7 +49,7 @@
     </w:p>
     <w:p>
       <w:pPr>
-        <w:spacing w:line="240" w:lineRule="auto"/>
+        <w:spacing w:after="0"/>
         <w:rPr>
           <w:rFonts w:cs="Times New Roman"/>
           <w:color w:val="000000" w:themeColor="text1"/>
@@ -66,7 +66,7 @@
     </w:p>
     <w:p>
       <w:pPr>
-        <w:spacing w:line="240" w:lineRule="auto"/>
+        <w:spacing w:after="0"/>
         <w:rPr>
           <w:rFonts w:cs="Times New Roman"/>
           <w:color w:val="000000" w:themeColor="text1"/>

</xml_diff>